<commit_message>
Chapters 10-12 audio pass: beat first, whole line after (50 paragraphs); rule 8a
Joshua, 2026-10-06: split or after-tagged lines sound wrong with
per-character voices. Every speaker anchor now comes before the quote
and each line is one unbroken quote. Still pending approval; no audio.

Co-Authored-By: Claude Opus 5.5 <noreply@anthropic.com>
Claude-Session: https://claude.ai/code/session_01EJ3GMtHm1zruGuc3sPX6WD
</commit_message>
<xml_diff>
--- a/manuscripts/10-12 Chapters - TRADDOMIUM Micro Battle.docx
+++ b/manuscripts/10-12 Chapters - TRADDOMIUM Micro Battle.docx
@@ -19,7 +19,7 @@
     <w:p>
       <w:pPr/>
       <w:r>
-        <w:t>🟡 PENDING APPROVAL — drafted 2026-10-06. Not canon until Joshua approves.</w:t>
+        <w:t>🟡 PENDING APPROVAL — drafted 2026-10-06, audio pass applied. Not canon until Joshua approves.</w:t>
       </w:r>
     </w:p>
     <w:p>
@@ -33,13 +33,7 @@
     <w:p>
       <w:pPr/>
       <w:r>
-        <w:t>Mark had the utility vehicle moving before Jack's door was fully shut.</w:t>
-      </w:r>
-    </w:p>
-    <w:p>
-      <w:pPr/>
-      <w:r>
-        <w:t>"Medical first," Mark said into his radio, steering one-handed out of the laboratory lot. "Doctor Mercer, this is Jones. Doctor Bennett wants you briefed in person. I'll have someone at your door in ten minutes."</w:t>
+        <w:t>Mark had the utility vehicle rolling out of the laboratory lot before Jack's door was fully shut, steering one-handed with the radio already at his mouth. "Medical first. Doctor Mercer, this is Jones. Doctor Bennett wants you briefed in person. I'll have someone at your door in ten minutes."</w:t>
       </w:r>
     </w:p>
     <w:p>
@@ -213,7 +207,7 @@
     <w:p>
       <w:pPr/>
       <w:r>
-        <w:t>"You want me to go first?" Mark asked.</w:t>
+        <w:t>Mark looked over at him. "You want me to go first?"</w:t>
       </w:r>
     </w:p>
     <w:p>
@@ -249,7 +243,7 @@
     <w:p>
       <w:pPr/>
       <w:r>
-        <w:t>"Aiden," Jack said quietly. "I'm Jack Bennett. We talked on the radio."</w:t>
+        <w:t>Jack kept his voice quiet. "Aiden, I'm Jack Bennett. We talked on the radio."</w:t>
       </w:r>
     </w:p>
     <w:p>
@@ -387,13 +381,13 @@
     <w:p>
       <w:pPr/>
       <w:r>
-        <w:t>"Sarah," he said softly. "Are you seeing this?"</w:t>
-      </w:r>
-    </w:p>
-    <w:p>
-      <w:pPr/>
-      <w:r>
-        <w:t>"I'm seeing it." Her voice had gone very calm, which meant she was working. "Jack, it's tracking you. Every time you move, the front of its body turns a little."</w:t>
+        <w:t>He spoke softly into his wrist. "Sarah, are you seeing this?"</w:t>
+      </w:r>
+    </w:p>
+    <w:p>
+      <w:pPr/>
+      <w:r>
+        <w:t>Her voice had gone very calm, which meant she was working. "I'm seeing it. Jack, it's tracking you. Every time you move, the front of its body turns a little."</w:t>
       </w:r>
     </w:p>
     <w:p>
@@ -417,7 +411,7 @@
     <w:p>
       <w:pPr/>
       <w:r>
-        <w:t>"I know what it is when it's the size of a pea." Aiden wiped his forehead on his sleeve, the fogger still dangling from one hand. "We like them in here. They eat aphids, whiteflies, all the stuff that gets into the seedlings. We never spray when we see one. They're friendly."</w:t>
+        <w:t>Aiden wiped his forehead on his sleeve, the fogger still dangling from one hand. "I know what it is when it's the size of a pea. We like them in here. They eat aphids, whiteflies, all the stuff that gets into the seedlings. We never spray when we see one. They're friendly."</w:t>
       </w:r>
     </w:p>
     <w:p>
@@ -453,7 +447,7 @@
     <w:p>
       <w:pPr/>
       <w:r>
-        <w:t>"Because it's cold," Aiden said. "They hunt by sight, in daylight. Mornings like this, they sit in the sun and warm up before they do anything." He swallowed. "It hasn't moved since I called you because it's waiting."</w:t>
+        <w:t>Aiden swallowed. "Because it's cold. They hunt by sight, in daylight. Mornings like this, they sit in the sun and warm up before they do anything. It hasn't moved since I called you because it's waiting."</w:t>
       </w:r>
     </w:p>
     <w:p>
@@ -495,7 +489,7 @@
     <w:p>
       <w:pPr/>
       <w:r>
-        <w:t>"The grow lights," Sarah said. "Aiden, do they run all night?"</w:t>
+        <w:t>Sarah had already put it together. "The grow lights. Aiden, do they run all night?"</w:t>
       </w:r>
     </w:p>
     <w:p>
@@ -507,7 +501,7 @@
     <w:p>
       <w:pPr/>
       <w:r>
-        <w:t>"Then every insect on this side of the island has been flying at your glass since dark. And that," she said quietly, "is breakfast. Lined up in a window."</w:t>
+        <w:t>Sarah's voice dropped. "Then every insect on this side of the island has been flying at your glass since dark. And that is breakfast. Lined up in a window."</w:t>
       </w:r>
     </w:p>
     <w:p>
@@ -519,7 +513,7 @@
     <w:p>
       <w:pPr/>
       <w:r>
-        <w:t>"It's not here for us yet," Sarah said. "It came for them. We just happen to be on the other side of the menu."</w:t>
+        <w:t>Sarah didn't let him off that easily. "It's not here for us yet. It came for them. We just happen to be on the other side of the menu."</w:t>
       </w:r>
     </w:p>
     <w:p>
@@ -531,13 +525,13 @@
     <w:p>
       <w:pPr/>
       <w:r>
-        <w:t>"Okay," he said. "So we stay inside, we stay still, we wait for it to eat and leave."</w:t>
-      </w:r>
-    </w:p>
-    <w:p>
-      <w:pPr/>
-      <w:r>
-        <w:t>"That's the plan?" Aiden asked.</w:t>
+        <w:t>Jack nodded slowly. "Okay. So we stay inside, we stay still, and we wait for it to eat and leave."</w:t>
+      </w:r>
+    </w:p>
+    <w:p>
+      <w:pPr/>
+      <w:r>
+        <w:t>Aiden looked from Jack to the glass and back again. "That's the plan?"</w:t>
       </w:r>
     </w:p>
     <w:p>
@@ -585,7 +579,7 @@
     <w:p>
       <w:pPr/>
       <w:r>
-        <w:t>"The roof vents open on a timer," Aiden whispered. "Every morning. Seven o'clock. To let the heat out."</w:t>
+        <w:t>Aiden's voice dropped to a whisper. "The roof vents open on a timer. Every morning. Seven o'clock. To let the heat out."</w:t>
       </w:r>
     </w:p>
     <w:p>
@@ -641,7 +635,7 @@
     <w:p>
       <w:pPr/>
       <w:r>
-        <w:t>"Aiden," Jack said, without taking his eyes off the roof. "The panel. Now. Slowly."</w:t>
+        <w:t>Jack didn't take his eyes off the roof. "Aiden. The panel. Now. Slowly."</w:t>
       </w:r>
     </w:p>
     <w:p>
@@ -695,7 +689,7 @@
     <w:p>
       <w:pPr/>
       <w:r>
-        <w:t>"Jack," Sarah said through his wrist. "It's watching him."</w:t>
+        <w:t>Sarah's voice came through his wrist, low and tight. "Jack, it's watching him."</w:t>
       </w:r>
     </w:p>
     <w:p>
@@ -809,7 +803,7 @@
     <w:p>
       <w:pPr/>
       <w:r>
-        <w:t>"You're the one who knows what to do down here if something comes through." Jack nodded toward a red fire extinguisher hanging beside the irrigation valves. "That's carbon dioxide. Cold, loud, and it'll startle almost anything. If you have to use it, aim at the face, not the body."</w:t>
+        <w:t>Jack nodded toward a red fire extinguisher hanging beside the irrigation valves. "You're the one who knows what to do down here if something comes through. That's carbon dioxide. Cold, loud, and it'll startle almost anything. If you have to use it, aim at the face, not the body."</w:t>
       </w:r>
     </w:p>
     <w:p>
@@ -881,7 +875,7 @@
     <w:p>
       <w:pPr/>
       <w:r>
-        <w:t>"One," Sarah said quietly.</w:t>
+        <w:t>From his wrist, Sarah counted quietly. "One."</w:t>
       </w:r>
     </w:p>
     <w:p>
@@ -1019,7 +1013,7 @@
     <w:p>
       <w:pPr/>
       <w:r>
-        <w:t>"It's gone," Sarah said. Her voice was not quite steady. "Jack, it's gone. It went back into the grass."</w:t>
+        <w:t>Sarah's voice came through, not quite steady. "It's gone. Jack, it's gone. It went back into the grass."</w:t>
       </w:r>
     </w:p>
     <w:p>
@@ -1037,7 +1031,7 @@
     <w:p>
       <w:pPr/>
       <w:r>
-        <w:t>"You're bleeding," Mark called up.</w:t>
+        <w:t>Mark called up from below. "You're bleeding."</w:t>
       </w:r>
     </w:p>
     <w:p>
@@ -1061,7 +1055,7 @@
     <w:p>
       <w:pPr/>
       <w:r>
-        <w:t>"It looked at you." Aiden's voice was barely above a whisper.</w:t>
+        <w:t>Aiden's voice was barely above a whisper. "It looked at you."</w:t>
       </w:r>
     </w:p>
     <w:p>
@@ -1109,7 +1103,7 @@
     <w:p>
       <w:pPr/>
       <w:r>
-        <w:t>"And no trail," Jack said. "Like the mark you found by the southern perimeter."</w:t>
+        <w:t>Jack turned to him. "And no trail. Like the mark you found by the southern perimeter."</w:t>
       </w:r>
     </w:p>
     <w:p>
@@ -1139,13 +1133,13 @@
     <w:p>
       <w:pPr/>
       <w:r>
-        <w:t>"So something else out there jumps," Mark said finally.</w:t>
-      </w:r>
-    </w:p>
-    <w:p>
-      <w:pPr/>
-      <w:r>
-        <w:t>"Or something else out there lands," Sarah said. "We don't know yet. Write it down. Both."</w:t>
+        <w:t>Mark was the one who finally said it. "So something else out there jumps."</w:t>
+      </w:r>
+    </w:p>
+    <w:p>
+      <w:pPr/>
+      <w:r>
+        <w:t>Sarah's answer came straight back. "Or something else out there lands. We don't know yet. Write it down. Both."</w:t>
       </w:r>
     </w:p>
     <w:p>
@@ -1163,7 +1157,7 @@
     <w:p>
       <w:pPr/>
       <w:r>
-        <w:t>She didn't hesitate. "It's an animal. It came here for food, and it took food, and it left. It didn't break in because it didn't want to. It never cared about us." A pause. "That's rule one. It's an animal. It does what animals do."</w:t>
+        <w:t>She didn't hesitate. "It's an animal. It came here for food, and it took food, and it left. It didn't break in because it didn't want to. It never cared about us. That's rule one. It's an animal. It does what animals do."</w:t>
       </w:r>
     </w:p>
     <w:p>
@@ -1187,7 +1181,7 @@
     <w:p>
       <w:pPr/>
       <w:r>
-        <w:t>"Three. No lights shining outward along the edge after dark. The lights brought the insects, and the insects brought the spider."</w:t>
+        <w:t>Sarah kept going. "Three. No lights shining outward along the edge after dark. The lights brought the insects, and the insects brought the spider."</w:t>
       </w:r>
     </w:p>
     <w:p>
@@ -1199,31 +1193,31 @@
     <w:p>
       <w:pPr/>
       <w:r>
-        <w:t>"Then we put blackout blinds on the western glass at night. The plants get their light. The island doesn't see it."</w:t>
-      </w:r>
-    </w:p>
-    <w:p>
-      <w:pPr/>
-      <w:r>
-        <w:t>"Four," Jack said. "Anything an insect can fit through gets closed. Vents, cracks, drains. Doors."</w:t>
-      </w:r>
-    </w:p>
-    <w:p>
-      <w:pPr/>
-      <w:r>
-        <w:t>"Five. Move slowly near glass."</w:t>
-      </w:r>
-    </w:p>
-    <w:p>
-      <w:pPr/>
-      <w:r>
-        <w:t>"Six. Nobody goes out alone."</w:t>
-      </w:r>
-    </w:p>
-    <w:p>
-      <w:pPr/>
-      <w:r>
-        <w:t>There was a pause on the line. "Are you writing that down?" Jack asked.</w:t>
+        <w:t>Sarah had the answer ready. "Then we put blackout blinds on the western glass at night. The plants get their light. The island doesn't see it."</w:t>
+      </w:r>
+    </w:p>
+    <w:p>
+      <w:pPr/>
+      <w:r>
+        <w:t>Jack added the next one himself. "Four. Anything an insect can fit through gets closed. Vents, cracks, drains. Doors."</w:t>
+      </w:r>
+    </w:p>
+    <w:p>
+      <w:pPr/>
+      <w:r>
+        <w:t>Sarah came straight back with another. "Five. Move slowly near glass."</w:t>
+      </w:r>
+    </w:p>
+    <w:p>
+      <w:pPr/>
+      <w:r>
+        <w:t>Jack looked at Mark, then at Aiden. "Six. Nobody goes out alone."</w:t>
+      </w:r>
+    </w:p>
+    <w:p>
+      <w:pPr/>
+      <w:r>
+        <w:t>There was a pause on the line, and Jack asked, "Are you writing that down?"</w:t>
       </w:r>
     </w:p>
     <w:p>
@@ -1285,7 +1279,7 @@
     <w:p>
       <w:pPr/>
       <w:r>
-        <w:t>"Fifty people," Mark said, already moving toward the service door. "Asking for you by name. That's either very good or very bad."</w:t>
+        <w:t>Mark was already moving toward the service door. "Fifty people. Asking for you by name. That's either very good or very bad."</w:t>
       </w:r>
     </w:p>
     <w:p>
@@ -1477,7 +1471,7 @@
     <w:p>
       <w:pPr/>
       <w:r>
-        <w:t>"Doctor Mercer," she said, holding out her hand. "We've met. Mostly by phone."</w:t>
+        <w:t>She held out her hand. "Doctor Mercer. We've met. Mostly by phone."</w:t>
       </w:r>
     </w:p>
     <w:p>
@@ -1489,7 +1483,7 @@
     <w:p>
       <w:pPr/>
       <w:r>
-        <w:t>"Don't be. You answered them." She glanced at his hand, then at Sarah, then back at him. "You're bleeding. She's pregnant. You've both been up all night. After this, you're both coming to medical."</w:t>
+        <w:t>She glanced at his hand, then at Sarah, then back at him. "Don't be. You answered them. You're bleeding. She's pregnant. You've both been up all night. After this, you're both coming to medical."</w:t>
       </w:r>
     </w:p>
     <w:p>
@@ -1561,7 +1555,7 @@
     <w:p>
       <w:pPr/>
       <w:r>
-        <w:t>"Good morning," he said. "My name is Jack Bennett. I run the TOMBS project at the laboratory. Some of you know me. Most of you probably just know the building."</w:t>
+        <w:t>He gripped the stand with his good hand. "Good morning. My name is Jack Bennett. I run the TOMBS project at the laboratory. Some of you know me. Most of you probably just know the building."</w:t>
       </w:r>
     </w:p>
     <w:p>
@@ -1585,7 +1579,7 @@
     <w:p>
       <w:pPr/>
       <w:r>
-        <w:t>"The grass outside didn't grow," Jack said. "We got smaller."</w:t>
+        <w:t>Jack let that settle before he finished. "The grass outside didn't grow. We got smaller."</w:t>
       </w:r>
     </w:p>
     <w:p>
@@ -1633,19 +1627,13 @@
     <w:p>
       <w:pPr/>
       <w:r>
-        <w:t>"Why don't we attack it?" someone called from the back.</w:t>
-      </w:r>
-    </w:p>
-    <w:p>
-      <w:pPr/>
-      <w:r>
-        <w:t>Jack looked at Sarah. She stepped toward the microphone.</w:t>
-      </w:r>
-    </w:p>
-    <w:p>
-      <w:pPr/>
-      <w:r>
-        <w:t>"Lena," she said. "Play the greenhouse."</w:t>
+        <w:t>Someone called out from the back. "Why don't we attack it?"</w:t>
+      </w:r>
+    </w:p>
+    <w:p>
+      <w:pPr/>
+      <w:r>
+        <w:t>Jack looked at Sarah. She stepped up to the microphone. "Lena, play the greenhouse."</w:t>
       </w:r>
     </w:p>
     <w:p>
@@ -1699,7 +1687,7 @@
     <w:p>
       <w:pPr/>
       <w:r>
-        <w:t>"That's why we don't attack," Sarah said. "Because it wasn't attacking us. It came for the insects on the glass, and it took one, and it left. We don't know yet what else is out there. Until we do, we don't start fights we can't finish."</w:t>
+        <w:t>Sarah's voice carried over every speaker. "That's why we don't attack. Because it wasn't attacking us. It came for the insects on the glass, and it took one, and it left. We don't know yet what else is out there. Until we do, we don't start fights we can't finish."</w:t>
       </w:r>
     </w:p>
     <w:p>
@@ -1747,7 +1735,7 @@
     <w:p>
       <w:pPr/>
       <w:r>
-        <w:t>"I don't know," he said. "I haven't tried. And I'm not going to try until I understand exactly what it would do. If I get that wrong, I don't get a second chance, and neither do you."</w:t>
+        <w:t>Jack answered slowly. "I don't know. I haven't tried. And I'm not going to try until I understand exactly what it would do. If I get that wrong, I don't get a second chance, and neither do you."</w:t>
       </w:r>
     </w:p>
     <w:p>
@@ -1795,7 +1783,7 @@
     <w:p>
       <w:pPr/>
       <w:r>
-        <w:t>"Paul Harlan," the man said, for the room's benefit rather than Jack's. "I run the machine shop. I've kept half the machinery in this town running since before most of you got here." He folded his arms. "You've been very honest up there, Doctor. I'll give you that. You don't know how small, you don't know how to fix it, you don't know why the radio's dead."</w:t>
+        <w:t>He folded his arms and gave his name for the room's benefit rather than Jack's. "Paul Harlan. I run the machine shop. I've kept half the machinery in this town running since before most of you got here. You've been very honest up there, Doctor. I'll give you that. You don't know how small, you don't know how to fix it, you don't know why the radio's dead."</w:t>
       </w:r>
     </w:p>
     <w:p>
@@ -1807,7 +1795,7 @@
     <w:p>
       <w:pPr/>
       <w:r>
-        <w:t>"So let me ask you something you should know." Paul tilted his head. "You said it activated without authorization."</w:t>
+        <w:t>Paul tilted his head. "So let me ask you something you should know. You said it activated without authorization."</w:t>
       </w:r>
     </w:p>
     <w:p>
@@ -1819,7 +1807,13 @@
     <w:p>
       <w:pPr/>
       <w:r>
-        <w:t>"Machines like that don't switch themselves on. Somebody switched it on." He let that sit. "So who was it?"</w:t>
+        <w:t>Paul nodded, as though that settled something. "Machines like that don't switch themselves on. Somebody switched it on."</w:t>
+      </w:r>
+    </w:p>
+    <w:p>
+      <w:pPr/>
+      <w:r>
+        <w:t>He let that sit for a long moment before he finished. "So who was it?"</w:t>
       </w:r>
     </w:p>
     <w:p>

</xml_diff>